<commit_message>
Correct 2026 teaching program release basis
</commit_message>
<xml_diff>
--- a/assets/teacher/teacher-program-v1.0.0.docx
+++ b/assets/teacher/teacher-program-v1.0.0.docx
@@ -167,7 +167,7 @@
                 <w:color w:val="241D20"/>
                 <w:sz w:val="19"/>
               </w:rPr>
-              <w:t>2027 — Teacher to confirm</w:t>
+              <w:t>2026 — confirmed</w:t>
             </w:r>
           </w:p>
         </w:tc>
@@ -279,7 +279,7 @@
                 <w:color w:val="241D20"/>
                 <w:sz w:val="19"/>
               </w:rPr>
-              <w:t>Current/default 2026–2027 pathway; new Communication Technology syllabus begins in 2028</w:t>
+              <w:t>Graphics Technology 2019 / GT5 selected for 2026; Communication Technology 2025 may be adopted early in 2026–2027 and is mandatory from 2028</w:t>
             </w:r>
           </w:p>
         </w:tc>
@@ -1201,7 +1201,7 @@
           <w:color w:val="241D20"/>
           <w:sz w:val="18"/>
         </w:rPr>
-        <w:t>delivery year; timetable and total course hours; 100-hour/200-hour classification and prior Core Modules 1–2 coverage; current local practical/WHS instructions; exact issued assessment dates, criteria and submission conditions.</w:t>
+        <w:t>timetable pattern and total course hours; 100-hour/200-hour classification and prior Core Modules 1–2 coverage; current local practical/WHS instructions; exact issued assessment dates, criteria and submission conditions.</w:t>
       </w:r>
     </w:p>
     <w:p>

</xml_diff>

<commit_message>
Improve Year 10 Graphics program links
</commit_message>
<xml_diff>
--- a/assets/teacher/teacher-program-v1.0.0.docx
+++ b/assets/teacher/teacher-program-v1.0.0.docx
@@ -449,6 +449,19 @@
             <w:sz w:val="20"/>
           </w:rPr>
           <w:t>Current WWHS Assessment Handbooks</w:t>
+        </w:r>
+      </w:hyperlink>
+      <w:r>
+        <w:t xml:space="preserve">  |  </w:t>
+      </w:r>
+      <w:hyperlink r:id="rId73">
+        <w:r>
+          <w:rPr>
+            <w:rStyle w:val="Hyperlink"/>
+            <w:color w:val="0563C1"/>
+            <w:u w:val="single"/>
+          </w:rPr>
+          <w:t>Open the Year 10 Graphics course site</w:t>
         </w:r>
       </w:hyperlink>
     </w:p>
@@ -1541,16 +1554,19 @@
             <w:pPr>
               <w:spacing w:after="0" w:before="0" w:line="240" w:lineRule="auto"/>
             </w:pPr>
-            <w:r>
-              <w:rPr>
-                <w:rFonts w:ascii="Arial" w:hAnsi="Arial"/>
-                <w:b/>
-                <w:i w:val="0"/>
-                <w:color w:val="241D20"/>
-                <w:sz w:val="19"/>
-              </w:rPr>
-              <w:t>Site/theory</w:t>
-            </w:r>
+            <w:hyperlink r:id="rId61">
+              <w:r>
+                <w:rPr>
+                  <w:rFonts w:ascii="Arial" w:hAnsi="Arial"/>
+                  <w:b/>
+                  <w:i w:val="0"/>
+                  <w:color w:val="0563C1"/>
+                  <w:sz w:val="19"/>
+                  <w:u w:val="single"/>
+                </w:rPr>
+                <w:t>Site/theory</w:t>
+              </w:r>
+            </w:hyperlink>
           </w:p>
         </w:tc>
         <w:tc>
@@ -1568,16 +1584,18 @@
             <w:pPr>
               <w:spacing w:after="0" w:before="0" w:line="240" w:lineRule="auto"/>
             </w:pPr>
-            <w:r>
-              <w:rPr>
-                <w:rFonts w:ascii="Arial" w:hAnsi="Arial"/>
-                <w:b w:val="0"/>
-                <w:i w:val="0"/>
-                <w:color w:val="241D20"/>
-                <w:sz w:val="19"/>
-              </w:rPr>
-              <w:t>Safety signs and visual conventions</w:t>
-            </w:r>
+            <w:hyperlink r:id="rId61">
+              <w:r>
+                <w:rPr>
+                  <w:rFonts w:ascii="Arial" w:hAnsi="Arial"/>
+                  <w:b w:val="0"/>
+                  <w:i w:val="0"/>
+                  <w:color w:val="0563C1"/>
+                  <w:sz w:val="19"/>
+                </w:rPr>
+                <w:t>Safety signs and visual conventions</w:t>
+              </w:r>
+            </w:hyperlink>
           </w:p>
         </w:tc>
         <w:tc>
@@ -1911,16 +1929,19 @@
             <w:pPr>
               <w:spacing w:after="0" w:before="0" w:line="240" w:lineRule="auto"/>
             </w:pPr>
-            <w:r>
-              <w:rPr>
-                <w:rFonts w:ascii="Arial" w:hAnsi="Arial"/>
-                <w:b/>
-                <w:i w:val="0"/>
-                <w:color w:val="241D20"/>
-                <w:sz w:val="19"/>
-              </w:rPr>
-              <w:t>Project/folio</w:t>
-            </w:r>
+            <w:hyperlink r:id="rId16">
+              <w:r>
+                <w:rPr>
+                  <w:rFonts w:ascii="Arial" w:hAnsi="Arial"/>
+                  <w:b/>
+                  <w:i w:val="0"/>
+                  <w:color w:val="0563C1"/>
+                  <w:sz w:val="19"/>
+                  <w:u w:val="single"/>
+                </w:rPr>
+                <w:t>Project/folio</w:t>
+              </w:r>
+            </w:hyperlink>
           </w:p>
         </w:tc>
         <w:tc>
@@ -1938,16 +1959,18 @@
             <w:pPr>
               <w:spacing w:after="0" w:before="0" w:line="240" w:lineRule="auto"/>
             </w:pPr>
-            <w:r>
-              <w:rPr>
-                <w:rFonts w:ascii="Arial" w:hAnsi="Arial"/>
-                <w:b w:val="0"/>
-                <w:i w:val="0"/>
-                <w:color w:val="241D20"/>
-                <w:sz w:val="19"/>
-              </w:rPr>
-              <w:t>Retain: Safety signs and visual conventions</w:t>
-            </w:r>
+            <w:hyperlink r:id="rId61">
+              <w:r>
+                <w:rPr>
+                  <w:rFonts w:ascii="Arial" w:hAnsi="Arial"/>
+                  <w:b w:val="0"/>
+                  <w:i w:val="0"/>
+                  <w:color w:val="0563C1"/>
+                  <w:sz w:val="19"/>
+                </w:rPr>
+                <w:t>Retain: Safety signs and visual conventions</w:t>
+              </w:r>
+            </w:hyperlink>
           </w:p>
         </w:tc>
         <w:tc>
@@ -2110,16 +2133,19 @@
             <w:pPr>
               <w:spacing w:after="0" w:before="0" w:line="240" w:lineRule="auto"/>
             </w:pPr>
-            <w:r>
-              <w:rPr>
-                <w:rFonts w:ascii="Arial" w:hAnsi="Arial"/>
-                <w:b/>
-                <w:i w:val="0"/>
-                <w:color w:val="241D20"/>
-                <w:sz w:val="19"/>
-              </w:rPr>
-              <w:t>Site/theory</w:t>
-            </w:r>
+            <w:hyperlink r:id="rId62">
+              <w:r>
+                <w:rPr>
+                  <w:rFonts w:ascii="Arial" w:hAnsi="Arial"/>
+                  <w:b/>
+                  <w:i w:val="0"/>
+                  <w:color w:val="0563C1"/>
+                  <w:sz w:val="19"/>
+                  <w:u w:val="single"/>
+                </w:rPr>
+                <w:t>Site/theory</w:t>
+              </w:r>
+            </w:hyperlink>
           </w:p>
         </w:tc>
         <w:tc>
@@ -2137,16 +2163,18 @@
             <w:pPr>
               <w:spacing w:after="0" w:before="0" w:line="240" w:lineRule="auto"/>
             </w:pPr>
-            <w:r>
-              <w:rPr>
-                <w:rFonts w:ascii="Arial" w:hAnsi="Arial"/>
-                <w:b w:val="0"/>
-                <w:i w:val="0"/>
-                <w:color w:val="241D20"/>
-                <w:sz w:val="19"/>
-              </w:rPr>
-              <w:t>Vector graphics and Illustrator workflows</w:t>
-            </w:r>
+            <w:hyperlink r:id="rId62">
+              <w:r>
+                <w:rPr>
+                  <w:rFonts w:ascii="Arial" w:hAnsi="Arial"/>
+                  <w:b w:val="0"/>
+                  <w:i w:val="0"/>
+                  <w:color w:val="0563C1"/>
+                  <w:sz w:val="19"/>
+                </w:rPr>
+                <w:t>Vector graphics and Illustrator workflows</w:t>
+              </w:r>
+            </w:hyperlink>
           </w:p>
         </w:tc>
         <w:tc>
@@ -2480,16 +2508,19 @@
             <w:pPr>
               <w:spacing w:after="0" w:before="0" w:line="240" w:lineRule="auto"/>
             </w:pPr>
-            <w:r>
-              <w:rPr>
-                <w:rFonts w:ascii="Arial" w:hAnsi="Arial"/>
-                <w:b/>
-                <w:i w:val="0"/>
-                <w:color w:val="241D20"/>
-                <w:sz w:val="19"/>
-              </w:rPr>
-              <w:t>Project/folio</w:t>
-            </w:r>
+            <w:hyperlink r:id="rId20">
+              <w:r>
+                <w:rPr>
+                  <w:rFonts w:ascii="Arial" w:hAnsi="Arial"/>
+                  <w:b/>
+                  <w:i w:val="0"/>
+                  <w:color w:val="0563C1"/>
+                  <w:sz w:val="19"/>
+                  <w:u w:val="single"/>
+                </w:rPr>
+                <w:t>Project/folio</w:t>
+              </w:r>
+            </w:hyperlink>
           </w:p>
         </w:tc>
         <w:tc>
@@ -2507,16 +2538,18 @@
             <w:pPr>
               <w:spacing w:after="0" w:before="0" w:line="240" w:lineRule="auto"/>
             </w:pPr>
-            <w:r>
-              <w:rPr>
-                <w:rFonts w:ascii="Arial" w:hAnsi="Arial"/>
-                <w:b w:val="0"/>
-                <w:i w:val="0"/>
-                <w:color w:val="241D20"/>
-                <w:sz w:val="19"/>
-              </w:rPr>
-              <w:t>Retain: Vector graphics and Illustrator workflows</w:t>
-            </w:r>
+            <w:hyperlink r:id="rId62">
+              <w:r>
+                <w:rPr>
+                  <w:rFonts w:ascii="Arial" w:hAnsi="Arial"/>
+                  <w:b w:val="0"/>
+                  <w:i w:val="0"/>
+                  <w:color w:val="0563C1"/>
+                  <w:sz w:val="19"/>
+                </w:rPr>
+                <w:t>Retain: Vector graphics and Illustrator workflows</w:t>
+              </w:r>
+            </w:hyperlink>
           </w:p>
         </w:tc>
         <w:tc>
@@ -2679,16 +2712,19 @@
             <w:pPr>
               <w:spacing w:after="0" w:before="0" w:line="240" w:lineRule="auto"/>
             </w:pPr>
-            <w:r>
-              <w:rPr>
-                <w:rFonts w:ascii="Arial" w:hAnsi="Arial"/>
-                <w:b/>
-                <w:i w:val="0"/>
-                <w:color w:val="241D20"/>
-                <w:sz w:val="19"/>
-              </w:rPr>
-              <w:t>Site/theory</w:t>
-            </w:r>
+            <w:hyperlink r:id="rId63">
+              <w:r>
+                <w:rPr>
+                  <w:rFonts w:ascii="Arial" w:hAnsi="Arial"/>
+                  <w:b/>
+                  <w:i w:val="0"/>
+                  <w:color w:val="0563C1"/>
+                  <w:sz w:val="19"/>
+                  <w:u w:val="single"/>
+                </w:rPr>
+                <w:t>Site/theory</w:t>
+              </w:r>
+            </w:hyperlink>
           </w:p>
         </w:tc>
         <w:tc>
@@ -2706,16 +2742,18 @@
             <w:pPr>
               <w:spacing w:after="0" w:before="0" w:line="240" w:lineRule="auto"/>
             </w:pPr>
-            <w:r>
-              <w:rPr>
-                <w:rFonts w:ascii="Arial" w:hAnsi="Arial"/>
-                <w:b w:val="0"/>
-                <w:i w:val="0"/>
-                <w:color w:val="241D20"/>
-                <w:sz w:val="19"/>
-              </w:rPr>
-              <w:t>Design principles, audience, culture and intellectual property</w:t>
-            </w:r>
+            <w:hyperlink r:id="rId63">
+              <w:r>
+                <w:rPr>
+                  <w:rFonts w:ascii="Arial" w:hAnsi="Arial"/>
+                  <w:b w:val="0"/>
+                  <w:i w:val="0"/>
+                  <w:color w:val="0563C1"/>
+                  <w:sz w:val="19"/>
+                </w:rPr>
+                <w:t>Design principles, audience, culture and intellectual property</w:t>
+              </w:r>
+            </w:hyperlink>
           </w:p>
         </w:tc>
         <w:tc>
@@ -3049,16 +3087,19 @@
             <w:pPr>
               <w:spacing w:after="0" w:before="0" w:line="240" w:lineRule="auto"/>
             </w:pPr>
-            <w:r>
-              <w:rPr>
-                <w:rFonts w:ascii="Arial" w:hAnsi="Arial"/>
-                <w:b/>
-                <w:i w:val="0"/>
-                <w:color w:val="241D20"/>
-                <w:sz w:val="19"/>
-              </w:rPr>
-              <w:t>Project/folio</w:t>
-            </w:r>
+            <w:hyperlink r:id="rId24">
+              <w:r>
+                <w:rPr>
+                  <w:rFonts w:ascii="Arial" w:hAnsi="Arial"/>
+                  <w:b/>
+                  <w:i w:val="0"/>
+                  <w:color w:val="0563C1"/>
+                  <w:sz w:val="19"/>
+                  <w:u w:val="single"/>
+                </w:rPr>
+                <w:t>Project/folio</w:t>
+              </w:r>
+            </w:hyperlink>
           </w:p>
         </w:tc>
         <w:tc>
@@ -3076,16 +3117,18 @@
             <w:pPr>
               <w:spacing w:after="0" w:before="0" w:line="240" w:lineRule="auto"/>
             </w:pPr>
-            <w:r>
-              <w:rPr>
-                <w:rFonts w:ascii="Arial" w:hAnsi="Arial"/>
-                <w:b w:val="0"/>
-                <w:i w:val="0"/>
-                <w:color w:val="241D20"/>
-                <w:sz w:val="19"/>
-              </w:rPr>
-              <w:t>Retain: Design principles, audience, culture and intellectual property</w:t>
-            </w:r>
+            <w:hyperlink r:id="rId63">
+              <w:r>
+                <w:rPr>
+                  <w:rFonts w:ascii="Arial" w:hAnsi="Arial"/>
+                  <w:b w:val="0"/>
+                  <w:i w:val="0"/>
+                  <w:color w:val="0563C1"/>
+                  <w:sz w:val="19"/>
+                </w:rPr>
+                <w:t>Retain: Design principles, audience, culture and intellectual property</w:t>
+              </w:r>
+            </w:hyperlink>
           </w:p>
         </w:tc>
         <w:tc>
@@ -3491,16 +3534,19 @@
             <w:pPr>
               <w:spacing w:after="0" w:before="0" w:line="240" w:lineRule="auto"/>
             </w:pPr>
-            <w:r>
-              <w:rPr>
-                <w:rFonts w:ascii="Arial" w:hAnsi="Arial"/>
-                <w:b/>
-                <w:i w:val="0"/>
-                <w:color w:val="241D20"/>
-                <w:sz w:val="19"/>
-              </w:rPr>
-              <w:t>Site/theory</w:t>
-            </w:r>
+            <w:hyperlink r:id="rId64">
+              <w:r>
+                <w:rPr>
+                  <w:rFonts w:ascii="Arial" w:hAnsi="Arial"/>
+                  <w:b/>
+                  <w:i w:val="0"/>
+                  <w:color w:val="0563C1"/>
+                  <w:sz w:val="19"/>
+                  <w:u w:val="single"/>
+                </w:rPr>
+                <w:t>Site/theory</w:t>
+              </w:r>
+            </w:hyperlink>
           </w:p>
         </w:tc>
         <w:tc>
@@ -3518,16 +3564,18 @@
             <w:pPr>
               <w:spacing w:after="0" w:before="0" w:line="240" w:lineRule="auto"/>
             </w:pPr>
-            <w:r>
-              <w:rPr>
-                <w:rFonts w:ascii="Arial" w:hAnsi="Arial"/>
-                <w:b w:val="0"/>
-                <w:i w:val="0"/>
-                <w:color w:val="241D20"/>
-                <w:sz w:val="19"/>
-              </w:rPr>
-              <w:t>Spatial planning and architectural research</w:t>
-            </w:r>
+            <w:hyperlink r:id="rId64">
+              <w:r>
+                <w:rPr>
+                  <w:rFonts w:ascii="Arial" w:hAnsi="Arial"/>
+                  <w:b w:val="0"/>
+                  <w:i w:val="0"/>
+                  <w:color w:val="0563C1"/>
+                  <w:sz w:val="19"/>
+                </w:rPr>
+                <w:t>Spatial planning and architectural research</w:t>
+              </w:r>
+            </w:hyperlink>
           </w:p>
         </w:tc>
         <w:tc>
@@ -3861,16 +3909,19 @@
             <w:pPr>
               <w:spacing w:after="0" w:before="0" w:line="240" w:lineRule="auto"/>
             </w:pPr>
-            <w:r>
-              <w:rPr>
-                <w:rFonts w:ascii="Arial" w:hAnsi="Arial"/>
-                <w:b/>
-                <w:i w:val="0"/>
-                <w:color w:val="241D20"/>
-                <w:sz w:val="19"/>
-              </w:rPr>
-              <w:t>Project/folio</w:t>
-            </w:r>
+            <w:hyperlink r:id="rId28">
+              <w:r>
+                <w:rPr>
+                  <w:rFonts w:ascii="Arial" w:hAnsi="Arial"/>
+                  <w:b/>
+                  <w:i w:val="0"/>
+                  <w:color w:val="0563C1"/>
+                  <w:sz w:val="19"/>
+                  <w:u w:val="single"/>
+                </w:rPr>
+                <w:t>Project/folio</w:t>
+              </w:r>
+            </w:hyperlink>
           </w:p>
         </w:tc>
         <w:tc>
@@ -3888,16 +3939,18 @@
             <w:pPr>
               <w:spacing w:after="0" w:before="0" w:line="240" w:lineRule="auto"/>
             </w:pPr>
-            <w:r>
-              <w:rPr>
-                <w:rFonts w:ascii="Arial" w:hAnsi="Arial"/>
-                <w:b w:val="0"/>
-                <w:i w:val="0"/>
-                <w:color w:val="241D20"/>
-                <w:sz w:val="19"/>
-              </w:rPr>
-              <w:t>Retain: Spatial planning and architectural research</w:t>
-            </w:r>
+            <w:hyperlink r:id="rId64">
+              <w:r>
+                <w:rPr>
+                  <w:rFonts w:ascii="Arial" w:hAnsi="Arial"/>
+                  <w:b w:val="0"/>
+                  <w:i w:val="0"/>
+                  <w:color w:val="0563C1"/>
+                  <w:sz w:val="19"/>
+                </w:rPr>
+                <w:t>Retain: Spatial planning and architectural research</w:t>
+              </w:r>
+            </w:hyperlink>
           </w:p>
         </w:tc>
         <w:tc>
@@ -4060,16 +4113,19 @@
             <w:pPr>
               <w:spacing w:after="0" w:before="0" w:line="240" w:lineRule="auto"/>
             </w:pPr>
-            <w:r>
-              <w:rPr>
-                <w:rFonts w:ascii="Arial" w:hAnsi="Arial"/>
-                <w:b/>
-                <w:i w:val="0"/>
-                <w:color w:val="241D20"/>
-                <w:sz w:val="19"/>
-              </w:rPr>
-              <w:t>Site/theory</w:t>
-            </w:r>
+            <w:hyperlink r:id="rId65">
+              <w:r>
+                <w:rPr>
+                  <w:rFonts w:ascii="Arial" w:hAnsi="Arial"/>
+                  <w:b/>
+                  <w:i w:val="0"/>
+                  <w:color w:val="0563C1"/>
+                  <w:sz w:val="19"/>
+                  <w:u w:val="single"/>
+                </w:rPr>
+                <w:t>Site/theory</w:t>
+              </w:r>
+            </w:hyperlink>
           </w:p>
         </w:tc>
         <w:tc>
@@ -4087,16 +4143,18 @@
             <w:pPr>
               <w:spacing w:after="0" w:before="0" w:line="240" w:lineRule="auto"/>
             </w:pPr>
-            <w:r>
-              <w:rPr>
-                <w:rFonts w:ascii="Arial" w:hAnsi="Arial"/>
-                <w:b w:val="0"/>
-                <w:i w:val="0"/>
-                <w:color w:val="241D20"/>
-                <w:sz w:val="19"/>
-              </w:rPr>
-              <w:t>CAD drafting, drawing views and conventions</w:t>
-            </w:r>
+            <w:hyperlink r:id="rId65">
+              <w:r>
+                <w:rPr>
+                  <w:rFonts w:ascii="Arial" w:hAnsi="Arial"/>
+                  <w:b w:val="0"/>
+                  <w:i w:val="0"/>
+                  <w:color w:val="0563C1"/>
+                  <w:sz w:val="19"/>
+                </w:rPr>
+                <w:t>CAD drafting, drawing views and conventions</w:t>
+              </w:r>
+            </w:hyperlink>
           </w:p>
         </w:tc>
         <w:tc>
@@ -4430,16 +4488,19 @@
             <w:pPr>
               <w:spacing w:after="0" w:before="0" w:line="240" w:lineRule="auto"/>
             </w:pPr>
-            <w:r>
-              <w:rPr>
-                <w:rFonts w:ascii="Arial" w:hAnsi="Arial"/>
-                <w:b/>
-                <w:i w:val="0"/>
-                <w:color w:val="241D20"/>
-                <w:sz w:val="19"/>
-              </w:rPr>
-              <w:t>Project/folio</w:t>
-            </w:r>
+            <w:hyperlink r:id="rId32">
+              <w:r>
+                <w:rPr>
+                  <w:rFonts w:ascii="Arial" w:hAnsi="Arial"/>
+                  <w:b/>
+                  <w:i w:val="0"/>
+                  <w:color w:val="0563C1"/>
+                  <w:sz w:val="19"/>
+                  <w:u w:val="single"/>
+                </w:rPr>
+                <w:t>Project/folio</w:t>
+              </w:r>
+            </w:hyperlink>
           </w:p>
         </w:tc>
         <w:tc>
@@ -4457,16 +4518,18 @@
             <w:pPr>
               <w:spacing w:after="0" w:before="0" w:line="240" w:lineRule="auto"/>
             </w:pPr>
-            <w:r>
-              <w:rPr>
-                <w:rFonts w:ascii="Arial" w:hAnsi="Arial"/>
-                <w:b w:val="0"/>
-                <w:i w:val="0"/>
-                <w:color w:val="241D20"/>
-                <w:sz w:val="19"/>
-              </w:rPr>
-              <w:t>Retain: CAD drafting, drawing views and conventions</w:t>
-            </w:r>
+            <w:hyperlink r:id="rId65">
+              <w:r>
+                <w:rPr>
+                  <w:rFonts w:ascii="Arial" w:hAnsi="Arial"/>
+                  <w:b w:val="0"/>
+                  <w:i w:val="0"/>
+                  <w:color w:val="0563C1"/>
+                  <w:sz w:val="19"/>
+                </w:rPr>
+                <w:t>Retain: CAD drafting, drawing views and conventions</w:t>
+              </w:r>
+            </w:hyperlink>
           </w:p>
         </w:tc>
         <w:tc>
@@ -4629,16 +4692,19 @@
             <w:pPr>
               <w:spacing w:after="0" w:before="0" w:line="240" w:lineRule="auto"/>
             </w:pPr>
-            <w:r>
-              <w:rPr>
-                <w:rFonts w:ascii="Arial" w:hAnsi="Arial"/>
-                <w:b/>
-                <w:i w:val="0"/>
-                <w:color w:val="241D20"/>
-                <w:sz w:val="19"/>
-              </w:rPr>
-              <w:t>Site/theory</w:t>
-            </w:r>
+            <w:hyperlink r:id="rId66">
+              <w:r>
+                <w:rPr>
+                  <w:rFonts w:ascii="Arial" w:hAnsi="Arial"/>
+                  <w:b/>
+                  <w:i w:val="0"/>
+                  <w:color w:val="0563C1"/>
+                  <w:sz w:val="19"/>
+                  <w:u w:val="single"/>
+                </w:rPr>
+                <w:t>Site/theory</w:t>
+              </w:r>
+            </w:hyperlink>
           </w:p>
         </w:tc>
         <w:tc>
@@ -4656,16 +4722,18 @@
             <w:pPr>
               <w:spacing w:after="0" w:before="0" w:line="240" w:lineRule="auto"/>
             </w:pPr>
-            <w:r>
-              <w:rPr>
-                <w:rFonts w:ascii="Arial" w:hAnsi="Arial"/>
-                <w:b w:val="0"/>
-                <w:i w:val="0"/>
-                <w:color w:val="241D20"/>
-                <w:sz w:val="19"/>
-              </w:rPr>
-              <w:t>Sustainability, building context and professional roles</w:t>
-            </w:r>
+            <w:hyperlink r:id="rId66">
+              <w:r>
+                <w:rPr>
+                  <w:rFonts w:ascii="Arial" w:hAnsi="Arial"/>
+                  <w:b w:val="0"/>
+                  <w:i w:val="0"/>
+                  <w:color w:val="0563C1"/>
+                  <w:sz w:val="19"/>
+                </w:rPr>
+                <w:t>Sustainability, building context and professional roles</w:t>
+              </w:r>
+            </w:hyperlink>
           </w:p>
         </w:tc>
         <w:tc>
@@ -4999,16 +5067,19 @@
             <w:pPr>
               <w:spacing w:after="0" w:before="0" w:line="240" w:lineRule="auto"/>
             </w:pPr>
-            <w:r>
-              <w:rPr>
-                <w:rFonts w:ascii="Arial" w:hAnsi="Arial"/>
-                <w:b/>
-                <w:i w:val="0"/>
-                <w:color w:val="241D20"/>
-                <w:sz w:val="19"/>
-              </w:rPr>
-              <w:t>Project/folio</w:t>
-            </w:r>
+            <w:hyperlink r:id="rId36">
+              <w:r>
+                <w:rPr>
+                  <w:rFonts w:ascii="Arial" w:hAnsi="Arial"/>
+                  <w:b/>
+                  <w:i w:val="0"/>
+                  <w:color w:val="0563C1"/>
+                  <w:sz w:val="19"/>
+                  <w:u w:val="single"/>
+                </w:rPr>
+                <w:t>Project/folio</w:t>
+              </w:r>
+            </w:hyperlink>
           </w:p>
         </w:tc>
         <w:tc>
@@ -5026,16 +5097,18 @@
             <w:pPr>
               <w:spacing w:after="0" w:before="0" w:line="240" w:lineRule="auto"/>
             </w:pPr>
-            <w:r>
-              <w:rPr>
-                <w:rFonts w:ascii="Arial" w:hAnsi="Arial"/>
-                <w:b w:val="0"/>
-                <w:i w:val="0"/>
-                <w:color w:val="241D20"/>
-                <w:sz w:val="19"/>
-              </w:rPr>
-              <w:t>Retain: Sustainability, building context and professional roles</w:t>
-            </w:r>
+            <w:hyperlink r:id="rId66">
+              <w:r>
+                <w:rPr>
+                  <w:rFonts w:ascii="Arial" w:hAnsi="Arial"/>
+                  <w:b w:val="0"/>
+                  <w:i w:val="0"/>
+                  <w:color w:val="0563C1"/>
+                  <w:sz w:val="19"/>
+                </w:rPr>
+                <w:t>Retain: Sustainability, building context and professional roles</w:t>
+              </w:r>
+            </w:hyperlink>
           </w:p>
         </w:tc>
         <w:tc>
@@ -5441,16 +5514,19 @@
             <w:pPr>
               <w:spacing w:after="0" w:before="0" w:line="240" w:lineRule="auto"/>
             </w:pPr>
-            <w:r>
-              <w:rPr>
-                <w:rFonts w:ascii="Arial" w:hAnsi="Arial"/>
-                <w:b/>
-                <w:i w:val="0"/>
-                <w:color w:val="241D20"/>
-                <w:sz w:val="19"/>
-              </w:rPr>
-              <w:t>Site/theory</w:t>
-            </w:r>
+            <w:hyperlink r:id="rId67">
+              <w:r>
+                <w:rPr>
+                  <w:rFonts w:ascii="Arial" w:hAnsi="Arial"/>
+                  <w:b/>
+                  <w:i w:val="0"/>
+                  <w:color w:val="0563C1"/>
+                  <w:sz w:val="19"/>
+                  <w:u w:val="single"/>
+                </w:rPr>
+                <w:t>Site/theory</w:t>
+              </w:r>
+            </w:hyperlink>
           </w:p>
         </w:tc>
         <w:tc>
@@ -5468,16 +5544,18 @@
             <w:pPr>
               <w:spacing w:after="0" w:before="0" w:line="240" w:lineRule="auto"/>
             </w:pPr>
-            <w:r>
-              <w:rPr>
-                <w:rFonts w:ascii="Arial" w:hAnsi="Arial"/>
-                <w:b w:val="0"/>
-                <w:i w:val="0"/>
-                <w:color w:val="241D20"/>
-                <w:sz w:val="19"/>
-              </w:rPr>
-              <w:t>Projection systems and freehand communication</w:t>
-            </w:r>
+            <w:hyperlink r:id="rId67">
+              <w:r>
+                <w:rPr>
+                  <w:rFonts w:ascii="Arial" w:hAnsi="Arial"/>
+                  <w:b w:val="0"/>
+                  <w:i w:val="0"/>
+                  <w:color w:val="0563C1"/>
+                  <w:sz w:val="19"/>
+                </w:rPr>
+                <w:t>Projection systems and freehand communication</w:t>
+              </w:r>
+            </w:hyperlink>
           </w:p>
         </w:tc>
         <w:tc>
@@ -5811,16 +5889,19 @@
             <w:pPr>
               <w:spacing w:after="0" w:before="0" w:line="240" w:lineRule="auto"/>
             </w:pPr>
-            <w:r>
-              <w:rPr>
-                <w:rFonts w:ascii="Arial" w:hAnsi="Arial"/>
-                <w:b/>
-                <w:i w:val="0"/>
-                <w:color w:val="241D20"/>
-                <w:sz w:val="19"/>
-              </w:rPr>
-              <w:t>Project/folio</w:t>
-            </w:r>
+            <w:hyperlink r:id="rId40">
+              <w:r>
+                <w:rPr>
+                  <w:rFonts w:ascii="Arial" w:hAnsi="Arial"/>
+                  <w:b/>
+                  <w:i w:val="0"/>
+                  <w:color w:val="0563C1"/>
+                  <w:sz w:val="19"/>
+                  <w:u w:val="single"/>
+                </w:rPr>
+                <w:t>Project/folio</w:t>
+              </w:r>
+            </w:hyperlink>
           </w:p>
         </w:tc>
         <w:tc>
@@ -5838,16 +5919,18 @@
             <w:pPr>
               <w:spacing w:after="0" w:before="0" w:line="240" w:lineRule="auto"/>
             </w:pPr>
-            <w:r>
-              <w:rPr>
-                <w:rFonts w:ascii="Arial" w:hAnsi="Arial"/>
-                <w:b w:val="0"/>
-                <w:i w:val="0"/>
-                <w:color w:val="241D20"/>
-                <w:sz w:val="19"/>
-              </w:rPr>
-              <w:t>Retain: Projection systems and freehand communication</w:t>
-            </w:r>
+            <w:hyperlink r:id="rId67">
+              <w:r>
+                <w:rPr>
+                  <w:rFonts w:ascii="Arial" w:hAnsi="Arial"/>
+                  <w:b w:val="0"/>
+                  <w:i w:val="0"/>
+                  <w:color w:val="0563C1"/>
+                  <w:sz w:val="19"/>
+                </w:rPr>
+                <w:t>Retain: Projection systems and freehand communication</w:t>
+              </w:r>
+            </w:hyperlink>
           </w:p>
         </w:tc>
         <w:tc>
@@ -6010,16 +6093,19 @@
             <w:pPr>
               <w:spacing w:after="0" w:before="0" w:line="240" w:lineRule="auto"/>
             </w:pPr>
-            <w:r>
-              <w:rPr>
-                <w:rFonts w:ascii="Arial" w:hAnsi="Arial"/>
-                <w:b/>
-                <w:i w:val="0"/>
-                <w:color w:val="241D20"/>
-                <w:sz w:val="19"/>
-              </w:rPr>
-              <w:t>Site/theory</w:t>
-            </w:r>
+            <w:hyperlink r:id="rId68">
+              <w:r>
+                <w:rPr>
+                  <w:rFonts w:ascii="Arial" w:hAnsi="Arial"/>
+                  <w:b/>
+                  <w:i w:val="0"/>
+                  <w:color w:val="0563C1"/>
+                  <w:sz w:val="19"/>
+                  <w:u w:val="single"/>
+                </w:rPr>
+                <w:t>Site/theory</w:t>
+              </w:r>
+            </w:hyperlink>
           </w:p>
         </w:tc>
         <w:tc>
@@ -6037,16 +6123,18 @@
             <w:pPr>
               <w:spacing w:after="0" w:before="0" w:line="240" w:lineRule="auto"/>
             </w:pPr>
-            <w:r>
-              <w:rPr>
-                <w:rFonts w:ascii="Arial" w:hAnsi="Arial"/>
-                <w:b w:val="0"/>
-                <w:i w:val="0"/>
-                <w:color w:val="241D20"/>
-                <w:sz w:val="19"/>
-              </w:rPr>
-              <w:t>CAD modelling, materials and manufacturing</w:t>
-            </w:r>
+            <w:hyperlink r:id="rId68">
+              <w:r>
+                <w:rPr>
+                  <w:rFonts w:ascii="Arial" w:hAnsi="Arial"/>
+                  <w:b w:val="0"/>
+                  <w:i w:val="0"/>
+                  <w:color w:val="0563C1"/>
+                  <w:sz w:val="19"/>
+                </w:rPr>
+                <w:t>CAD modelling, materials and manufacturing</w:t>
+              </w:r>
+            </w:hyperlink>
           </w:p>
         </w:tc>
         <w:tc>
@@ -6380,16 +6468,19 @@
             <w:pPr>
               <w:spacing w:after="0" w:before="0" w:line="240" w:lineRule="auto"/>
             </w:pPr>
-            <w:r>
-              <w:rPr>
-                <w:rFonts w:ascii="Arial" w:hAnsi="Arial"/>
-                <w:b/>
-                <w:i w:val="0"/>
-                <w:color w:val="241D20"/>
-                <w:sz w:val="19"/>
-              </w:rPr>
-              <w:t>Project/folio</w:t>
-            </w:r>
+            <w:hyperlink r:id="rId44">
+              <w:r>
+                <w:rPr>
+                  <w:rFonts w:ascii="Arial" w:hAnsi="Arial"/>
+                  <w:b/>
+                  <w:i w:val="0"/>
+                  <w:color w:val="0563C1"/>
+                  <w:sz w:val="19"/>
+                  <w:u w:val="single"/>
+                </w:rPr>
+                <w:t>Project/folio</w:t>
+              </w:r>
+            </w:hyperlink>
           </w:p>
         </w:tc>
         <w:tc>
@@ -6407,16 +6498,18 @@
             <w:pPr>
               <w:spacing w:after="0" w:before="0" w:line="240" w:lineRule="auto"/>
             </w:pPr>
-            <w:r>
-              <w:rPr>
-                <w:rFonts w:ascii="Arial" w:hAnsi="Arial"/>
-                <w:b w:val="0"/>
-                <w:i w:val="0"/>
-                <w:color w:val="241D20"/>
-                <w:sz w:val="19"/>
-              </w:rPr>
-              <w:t>Retain: CAD modelling, materials and manufacturing</w:t>
-            </w:r>
+            <w:hyperlink r:id="rId68">
+              <w:r>
+                <w:rPr>
+                  <w:rFonts w:ascii="Arial" w:hAnsi="Arial"/>
+                  <w:b w:val="0"/>
+                  <w:i w:val="0"/>
+                  <w:color w:val="0563C1"/>
+                  <w:sz w:val="19"/>
+                </w:rPr>
+                <w:t>Retain: CAD modelling, materials and manufacturing</w:t>
+              </w:r>
+            </w:hyperlink>
           </w:p>
         </w:tc>
         <w:tc>
@@ -6579,16 +6672,19 @@
             <w:pPr>
               <w:spacing w:after="0" w:before="0" w:line="240" w:lineRule="auto"/>
             </w:pPr>
-            <w:r>
-              <w:rPr>
-                <w:rFonts w:ascii="Arial" w:hAnsi="Arial"/>
-                <w:b/>
-                <w:i w:val="0"/>
-                <w:color w:val="241D20"/>
-                <w:sz w:val="19"/>
-              </w:rPr>
-              <w:t>Site/theory</w:t>
-            </w:r>
+            <w:hyperlink r:id="rId69">
+              <w:r>
+                <w:rPr>
+                  <w:rFonts w:ascii="Arial" w:hAnsi="Arial"/>
+                  <w:b/>
+                  <w:i w:val="0"/>
+                  <w:color w:val="0563C1"/>
+                  <w:sz w:val="19"/>
+                  <w:u w:val="single"/>
+                </w:rPr>
+                <w:t>Site/theory</w:t>
+              </w:r>
+            </w:hyperlink>
           </w:p>
         </w:tc>
         <w:tc>
@@ -6606,16 +6702,18 @@
             <w:pPr>
               <w:spacing w:after="0" w:before="0" w:line="240" w:lineRule="auto"/>
             </w:pPr>
-            <w:r>
-              <w:rPr>
-                <w:rFonts w:ascii="Arial" w:hAnsi="Arial"/>
-                <w:b w:val="0"/>
-                <w:i w:val="0"/>
-                <w:color w:val="241D20"/>
-                <w:sz w:val="19"/>
-              </w:rPr>
-              <w:t>Dimensioning, standards, assemblies and animation</w:t>
-            </w:r>
+            <w:hyperlink r:id="rId69">
+              <w:r>
+                <w:rPr>
+                  <w:rFonts w:ascii="Arial" w:hAnsi="Arial"/>
+                  <w:b w:val="0"/>
+                  <w:i w:val="0"/>
+                  <w:color w:val="0563C1"/>
+                  <w:sz w:val="19"/>
+                </w:rPr>
+                <w:t>Dimensioning, standards, assemblies and animation</w:t>
+              </w:r>
+            </w:hyperlink>
           </w:p>
         </w:tc>
         <w:tc>
@@ -6949,16 +7047,19 @@
             <w:pPr>
               <w:spacing w:after="0" w:before="0" w:line="240" w:lineRule="auto"/>
             </w:pPr>
-            <w:r>
-              <w:rPr>
-                <w:rFonts w:ascii="Arial" w:hAnsi="Arial"/>
-                <w:b/>
-                <w:i w:val="0"/>
-                <w:color w:val="241D20"/>
-                <w:sz w:val="19"/>
-              </w:rPr>
-              <w:t>Project/folio</w:t>
-            </w:r>
+            <w:hyperlink r:id="rId48">
+              <w:r>
+                <w:rPr>
+                  <w:rFonts w:ascii="Arial" w:hAnsi="Arial"/>
+                  <w:b/>
+                  <w:i w:val="0"/>
+                  <w:color w:val="0563C1"/>
+                  <w:sz w:val="19"/>
+                  <w:u w:val="single"/>
+                </w:rPr>
+                <w:t>Project/folio</w:t>
+              </w:r>
+            </w:hyperlink>
           </w:p>
         </w:tc>
         <w:tc>
@@ -6976,16 +7077,18 @@
             <w:pPr>
               <w:spacing w:after="0" w:before="0" w:line="240" w:lineRule="auto"/>
             </w:pPr>
-            <w:r>
-              <w:rPr>
-                <w:rFonts w:ascii="Arial" w:hAnsi="Arial"/>
-                <w:b w:val="0"/>
-                <w:i w:val="0"/>
-                <w:color w:val="241D20"/>
-                <w:sz w:val="19"/>
-              </w:rPr>
-              <w:t>Retain: Dimensioning, standards, assemblies and animation</w:t>
-            </w:r>
+            <w:hyperlink r:id="rId69">
+              <w:r>
+                <w:rPr>
+                  <w:rFonts w:ascii="Arial" w:hAnsi="Arial"/>
+                  <w:b w:val="0"/>
+                  <w:i w:val="0"/>
+                  <w:color w:val="0563C1"/>
+                  <w:sz w:val="19"/>
+                </w:rPr>
+                <w:t>Retain: Dimensioning, standards, assemblies and animation</w:t>
+              </w:r>
+            </w:hyperlink>
           </w:p>
         </w:tc>
         <w:tc>
@@ -7391,16 +7494,19 @@
             <w:pPr>
               <w:spacing w:after="0" w:before="0" w:line="240" w:lineRule="auto"/>
             </w:pPr>
-            <w:r>
-              <w:rPr>
-                <w:rFonts w:ascii="Arial" w:hAnsi="Arial"/>
-                <w:b/>
-                <w:i w:val="0"/>
-                <w:color w:val="241D20"/>
-                <w:sz w:val="19"/>
-              </w:rPr>
-              <w:t>Site/theory</w:t>
-            </w:r>
+            <w:hyperlink r:id="rId70">
+              <w:r>
+                <w:rPr>
+                  <w:rFonts w:ascii="Arial" w:hAnsi="Arial"/>
+                  <w:b/>
+                  <w:i w:val="0"/>
+                  <w:color w:val="0563C1"/>
+                  <w:sz w:val="19"/>
+                  <w:u w:val="single"/>
+                </w:rPr>
+                <w:t>Site/theory</w:t>
+              </w:r>
+            </w:hyperlink>
           </w:p>
         </w:tc>
         <w:tc>
@@ -7418,16 +7524,18 @@
             <w:pPr>
               <w:spacing w:after="0" w:before="0" w:line="240" w:lineRule="auto"/>
             </w:pPr>
-            <w:r>
-              <w:rPr>
-                <w:rFonts w:ascii="Arial" w:hAnsi="Arial"/>
-                <w:b w:val="0"/>
-                <w:i w:val="0"/>
-                <w:color w:val="241D20"/>
-                <w:sz w:val="19"/>
-              </w:rPr>
-              <w:t>Brief, audience, criteria and constraints</w:t>
-            </w:r>
+            <w:hyperlink r:id="rId70">
+              <w:r>
+                <w:rPr>
+                  <w:rFonts w:ascii="Arial" w:hAnsi="Arial"/>
+                  <w:b w:val="0"/>
+                  <w:i w:val="0"/>
+                  <w:color w:val="0563C1"/>
+                  <w:sz w:val="19"/>
+                </w:rPr>
+                <w:t>Brief, audience, criteria and constraints</w:t>
+              </w:r>
+            </w:hyperlink>
           </w:p>
         </w:tc>
         <w:tc>
@@ -7761,16 +7869,19 @@
             <w:pPr>
               <w:spacing w:after="0" w:before="0" w:line="240" w:lineRule="auto"/>
             </w:pPr>
-            <w:r>
-              <w:rPr>
-                <w:rFonts w:ascii="Arial" w:hAnsi="Arial"/>
-                <w:b/>
-                <w:i w:val="0"/>
-                <w:color w:val="241D20"/>
-                <w:sz w:val="19"/>
-              </w:rPr>
-              <w:t>Project/folio</w:t>
-            </w:r>
+            <w:hyperlink r:id="rId52">
+              <w:r>
+                <w:rPr>
+                  <w:rFonts w:ascii="Arial" w:hAnsi="Arial"/>
+                  <w:b/>
+                  <w:i w:val="0"/>
+                  <w:color w:val="0563C1"/>
+                  <w:sz w:val="19"/>
+                  <w:u w:val="single"/>
+                </w:rPr>
+                <w:t>Project/folio</w:t>
+              </w:r>
+            </w:hyperlink>
           </w:p>
         </w:tc>
         <w:tc>
@@ -7788,16 +7899,18 @@
             <w:pPr>
               <w:spacing w:after="0" w:before="0" w:line="240" w:lineRule="auto"/>
             </w:pPr>
-            <w:r>
-              <w:rPr>
-                <w:rFonts w:ascii="Arial" w:hAnsi="Arial"/>
-                <w:b w:val="0"/>
-                <w:i w:val="0"/>
-                <w:color w:val="241D20"/>
-                <w:sz w:val="19"/>
-              </w:rPr>
-              <w:t>Retain: Brief, audience, criteria and constraints</w:t>
-            </w:r>
+            <w:hyperlink r:id="rId70">
+              <w:r>
+                <w:rPr>
+                  <w:rFonts w:ascii="Arial" w:hAnsi="Arial"/>
+                  <w:b w:val="0"/>
+                  <w:i w:val="0"/>
+                  <w:color w:val="0563C1"/>
+                  <w:sz w:val="19"/>
+                </w:rPr>
+                <w:t>Retain: Brief, audience, criteria and constraints</w:t>
+              </w:r>
+            </w:hyperlink>
           </w:p>
         </w:tc>
         <w:tc>
@@ -7960,16 +8073,19 @@
             <w:pPr>
               <w:spacing w:after="0" w:before="0" w:line="240" w:lineRule="auto"/>
             </w:pPr>
-            <w:r>
-              <w:rPr>
-                <w:rFonts w:ascii="Arial" w:hAnsi="Arial"/>
-                <w:b/>
-                <w:i w:val="0"/>
-                <w:color w:val="241D20"/>
-                <w:sz w:val="19"/>
-              </w:rPr>
-              <w:t>Site/theory</w:t>
-            </w:r>
+            <w:hyperlink r:id="rId71">
+              <w:r>
+                <w:rPr>
+                  <w:rFonts w:ascii="Arial" w:hAnsi="Arial"/>
+                  <w:b/>
+                  <w:i w:val="0"/>
+                  <w:color w:val="0563C1"/>
+                  <w:sz w:val="19"/>
+                  <w:u w:val="single"/>
+                </w:rPr>
+                <w:t>Site/theory</w:t>
+              </w:r>
+            </w:hyperlink>
           </w:p>
         </w:tc>
         <w:tc>
@@ -7987,16 +8103,18 @@
             <w:pPr>
               <w:spacing w:after="0" w:before="0" w:line="240" w:lineRule="auto"/>
             </w:pPr>
-            <w:r>
-              <w:rPr>
-                <w:rFonts w:ascii="Arial" w:hAnsi="Arial"/>
-                <w:b w:val="0"/>
-                <w:i w:val="0"/>
-                <w:color w:val="241D20"/>
-                <w:sz w:val="19"/>
-              </w:rPr>
-              <w:t>Ideation, project management and digital development</w:t>
-            </w:r>
+            <w:hyperlink r:id="rId71">
+              <w:r>
+                <w:rPr>
+                  <w:rFonts w:ascii="Arial" w:hAnsi="Arial"/>
+                  <w:b w:val="0"/>
+                  <w:i w:val="0"/>
+                  <w:color w:val="0563C1"/>
+                  <w:sz w:val="19"/>
+                </w:rPr>
+                <w:t>Ideation, project management and digital development</w:t>
+              </w:r>
+            </w:hyperlink>
           </w:p>
         </w:tc>
         <w:tc>
@@ -8330,16 +8448,19 @@
             <w:pPr>
               <w:spacing w:after="0" w:before="0" w:line="240" w:lineRule="auto"/>
             </w:pPr>
-            <w:r>
-              <w:rPr>
-                <w:rFonts w:ascii="Arial" w:hAnsi="Arial"/>
-                <w:b/>
-                <w:i w:val="0"/>
-                <w:color w:val="241D20"/>
-                <w:sz w:val="19"/>
-              </w:rPr>
-              <w:t>Project/folio</w:t>
-            </w:r>
+            <w:hyperlink r:id="rId56">
+              <w:r>
+                <w:rPr>
+                  <w:rFonts w:ascii="Arial" w:hAnsi="Arial"/>
+                  <w:b/>
+                  <w:i w:val="0"/>
+                  <w:color w:val="0563C1"/>
+                  <w:sz w:val="19"/>
+                  <w:u w:val="single"/>
+                </w:rPr>
+                <w:t>Project/folio</w:t>
+              </w:r>
+            </w:hyperlink>
           </w:p>
         </w:tc>
         <w:tc>
@@ -8357,16 +8478,18 @@
             <w:pPr>
               <w:spacing w:after="0" w:before="0" w:line="240" w:lineRule="auto"/>
             </w:pPr>
-            <w:r>
-              <w:rPr>
-                <w:rFonts w:ascii="Arial" w:hAnsi="Arial"/>
-                <w:b w:val="0"/>
-                <w:i w:val="0"/>
-                <w:color w:val="241D20"/>
-                <w:sz w:val="19"/>
-              </w:rPr>
-              <w:t>Retain: Ideation, project management and digital development</w:t>
-            </w:r>
+            <w:hyperlink r:id="rId71">
+              <w:r>
+                <w:rPr>
+                  <w:rFonts w:ascii="Arial" w:hAnsi="Arial"/>
+                  <w:b w:val="0"/>
+                  <w:i w:val="0"/>
+                  <w:color w:val="0563C1"/>
+                  <w:sz w:val="19"/>
+                </w:rPr>
+                <w:t>Retain: Ideation, project management and digital development</w:t>
+              </w:r>
+            </w:hyperlink>
           </w:p>
         </w:tc>
         <w:tc>
@@ -8529,16 +8652,19 @@
             <w:pPr>
               <w:spacing w:after="0" w:before="0" w:line="240" w:lineRule="auto"/>
             </w:pPr>
-            <w:r>
-              <w:rPr>
-                <w:rFonts w:ascii="Arial" w:hAnsi="Arial"/>
-                <w:b/>
-                <w:i w:val="0"/>
-                <w:color w:val="241D20"/>
-                <w:sz w:val="19"/>
-              </w:rPr>
-              <w:t>Site/theory</w:t>
-            </w:r>
+            <w:hyperlink r:id="rId72">
+              <w:r>
+                <w:rPr>
+                  <w:rFonts w:ascii="Arial" w:hAnsi="Arial"/>
+                  <w:b/>
+                  <w:i w:val="0"/>
+                  <w:color w:val="0563C1"/>
+                  <w:sz w:val="19"/>
+                  <w:u w:val="single"/>
+                </w:rPr>
+                <w:t>Site/theory</w:t>
+              </w:r>
+            </w:hyperlink>
           </w:p>
         </w:tc>
         <w:tc>
@@ -8556,16 +8682,18 @@
             <w:pPr>
               <w:spacing w:after="0" w:before="0" w:line="240" w:lineRule="auto"/>
             </w:pPr>
-            <w:r>
-              <w:rPr>
-                <w:rFonts w:ascii="Arial" w:hAnsi="Arial"/>
-                <w:b w:val="0"/>
-                <w:i w:val="0"/>
-                <w:color w:val="241D20"/>
-                <w:sz w:val="19"/>
-              </w:rPr>
-              <w:t>Presentation, feedback and evaluation</w:t>
-            </w:r>
+            <w:hyperlink r:id="rId72">
+              <w:r>
+                <w:rPr>
+                  <w:rFonts w:ascii="Arial" w:hAnsi="Arial"/>
+                  <w:b w:val="0"/>
+                  <w:i w:val="0"/>
+                  <w:color w:val="0563C1"/>
+                  <w:sz w:val="19"/>
+                </w:rPr>
+                <w:t>Presentation, feedback and evaluation</w:t>
+              </w:r>
+            </w:hyperlink>
           </w:p>
         </w:tc>
         <w:tc>
@@ -8899,16 +9027,19 @@
             <w:pPr>
               <w:spacing w:after="0" w:before="0" w:line="240" w:lineRule="auto"/>
             </w:pPr>
-            <w:r>
-              <w:rPr>
-                <w:rFonts w:ascii="Arial" w:hAnsi="Arial"/>
-                <w:b/>
-                <w:i w:val="0"/>
-                <w:color w:val="241D20"/>
-                <w:sz w:val="19"/>
-              </w:rPr>
-              <w:t>Project/folio</w:t>
-            </w:r>
+            <w:hyperlink r:id="rId60">
+              <w:r>
+                <w:rPr>
+                  <w:rFonts w:ascii="Arial" w:hAnsi="Arial"/>
+                  <w:b/>
+                  <w:i w:val="0"/>
+                  <w:color w:val="0563C1"/>
+                  <w:sz w:val="19"/>
+                  <w:u w:val="single"/>
+                </w:rPr>
+                <w:t>Project/folio</w:t>
+              </w:r>
+            </w:hyperlink>
           </w:p>
         </w:tc>
         <w:tc>
@@ -8926,16 +9057,18 @@
             <w:pPr>
               <w:spacing w:after="0" w:before="0" w:line="240" w:lineRule="auto"/>
             </w:pPr>
-            <w:r>
-              <w:rPr>
-                <w:rFonts w:ascii="Arial" w:hAnsi="Arial"/>
-                <w:b w:val="0"/>
-                <w:i w:val="0"/>
-                <w:color w:val="241D20"/>
-                <w:sz w:val="19"/>
-              </w:rPr>
-              <w:t>Retain: Presentation, feedback and evaluation</w:t>
-            </w:r>
+            <w:hyperlink r:id="rId72">
+              <w:r>
+                <w:rPr>
+                  <w:rFonts w:ascii="Arial" w:hAnsi="Arial"/>
+                  <w:b w:val="0"/>
+                  <w:i w:val="0"/>
+                  <w:color w:val="0563C1"/>
+                  <w:sz w:val="19"/>
+                </w:rPr>
+                <w:t>Retain: Presentation, feedback and evaluation</w:t>
+              </w:r>
+            </w:hyperlink>
           </w:p>
         </w:tc>
         <w:tc>

</xml_diff>